<commit_message>
feat: improve content workflows and documentation
</commit_message>
<xml_diff>
--- a/个性化社交媒体写作Agent_详细使用手册.docx
+++ b/个性化社交媒体写作Agent_详细使用手册.docx
@@ -17,7 +17,7 @@
           <w:color w:val="2E74B5"/>
           <w:sz w:val="20"/>
         </w:rPr>
-        <w:t>OPERATOR GUIDE · V1.0</w:t>
+        <w:t>OPERATOR GUIDE · V1.1</w:t>
       </w:r>
     </w:p>
     <w:p>
@@ -71,9 +71,9 @@
         </w:rPr>
         <w:t>适用项目：SocialPostEditor</w:t>
         <w:br/>
-        <w:t>默认模型：DeepSeek（可切换 OpenAI）</w:t>
+        <w:t>运行模式：mock / DeepSeek / OpenAI</w:t>
         <w:br/>
-        <w:t>更新日期：2026 年 8 月 5 日</w:t>
+        <w:t>更新日期：2026 年 9 月 4 日</w:t>
       </w:r>
     </w:p>
     <w:p>
@@ -1400,7 +1400,7 @@
           <w:rFonts w:ascii="Calibri" w:hAnsi="Calibri" w:eastAsia="Microsoft YaHei"/>
           <w:color w:val="1A1A1A"/>
         </w:rPr>
-        <w:t>导入该角色过去真实发布的文章，并填写平台、语言、类型、主题、语气和真实性。</w:t>
+        <w:t>批量导入该角色过去真实发布的文章，由系统自动拆分、标注和去重，再人工纠错。</w:t>
       </w:r>
     </w:p>
     <w:p>
@@ -1464,7 +1464,7 @@
           <w:rFonts w:ascii="Calibri" w:hAnsi="Calibri" w:eastAsia="Microsoft YaHei"/>
           <w:color w:val="1A1A1A"/>
         </w:rPr>
-        <w:t>从 1–3 个候选稿中选择并人工修改。</w:t>
+        <w:t>在 review-inbox 中查看审核摘要，编辑并明确批准或拒绝内容。</w:t>
       </w:r>
     </w:p>
     <w:p>
@@ -1480,7 +1480,7 @@
           <w:rFonts w:ascii="Calibri" w:hAnsi="Calibri" w:eastAsia="Microsoft YaHei"/>
           <w:color w:val="1A1A1A"/>
         </w:rPr>
-        <w:t>保存“初稿—终稿—修改原因”，形成反馈闭环。</w:t>
+        <w:t>保存“初稿—终稿—修改原因”，再人工决定是否准入长期记忆。</w:t>
       </w:r>
     </w:p>
     <w:p>
@@ -1577,9 +1577,23 @@
         <w:br/>
         <w:t xml:space="preserve">  "name": "Hao｜AI 创业者个人账号",</w:t>
         <w:br/>
-        <w:t xml:space="preserve">  "description": "面向创业者、品牌负责人和 AI 从业者，分享 AI 产品、GEO、创业实践与品牌传播观察。",</w:t>
+        <w:t xml:space="preserve">  "description": "面向创业者、品牌负责人和 AI 从业者，分享 AI 产品与 GEO 实践。",</w:t>
         <w:br/>
-        <w:t xml:space="preserve">  "identity_rules": "只描述真实经历；不得虚构客户、融资、收入或效果；没有 proof_points 支持时不得使用具体数字；不承诺品牌一定能在 AI 回答中排名第一。"</w:t>
+        <w:t xml:space="preserve">  "identity_rules": "只描述真实经历；不得虚构客户、融资、收入或效果。",</w:t>
+        <w:br/>
+        <w:t xml:space="preserve">  "default_generate_params": {</w:t>
+        <w:br/>
+        <w:t xml:space="preserve">    "platform": "LinkedIn",</w:t>
+        <w:br/>
+        <w:t xml:space="preserve">    "language": "zh-CN",</w:t>
+        <w:br/>
+        <w:t xml:space="preserve">    "audience": "品牌与 AI 从业者",</w:t>
+        <w:br/>
+        <w:t xml:space="preserve">    "tone": "克制、具体、基于证据",</w:t>
+        <w:br/>
+        <w:t xml:space="preserve">    "banned_phrases": ["绝对领先", "颠覆行业"]</w:t>
+        <w:br/>
+        <w:t xml:space="preserve">  }</w:t>
         <w:br/>
         <w:t>}</w:t>
       </w:r>
@@ -1858,6 +1872,60 @@
                 <w:color w:val="1A1A1A"/>
                 <w:sz w:val="18"/>
               </w:rPr>
+              <w:t>default_generate_params</w:t>
+            </w:r>
+          </w:p>
+        </w:tc>
+        <w:tc>
+          <w:tcPr>
+            <w:tcW w:type="dxa" w:w="7560"/>
+            <w:tcMar>
+              <w:top w:w="80" w:type="dxa"/>
+              <w:start w:w="120" w:type="dxa"/>
+              <w:bottom w:w="80" w:type="dxa"/>
+              <w:end w:w="120" w:type="dxa"/>
+            </w:tcMar>
+            <w:vAlign w:val="center"/>
+          </w:tcPr>
+          <w:p>
+            <w:pPr>
+              <w:spacing w:before="0" w:after="40" w:line="276" w:lineRule="auto"/>
+            </w:pPr>
+            <w:r>
+              <w:rPr>
+                <w:rFonts w:ascii="Calibri" w:hAnsi="Calibri" w:eastAsia="Microsoft YaHei"/>
+                <w:b w:val="0"/>
+                <w:color w:val="1A1A1A"/>
+                <w:sz w:val="18"/>
+              </w:rPr>
+              <w:t>角色长期复用的平台、受众、语气、长度和禁用词</w:t>
+            </w:r>
+          </w:p>
+        </w:tc>
+      </w:tr>
+      <w:tr>
+        <w:tc>
+          <w:tcPr>
+            <w:tcW w:type="dxa" w:w="1800"/>
+            <w:tcMar>
+              <w:top w:w="80" w:type="dxa"/>
+              <w:start w:w="120" w:type="dxa"/>
+              <w:bottom w:w="80" w:type="dxa"/>
+              <w:end w:w="120" w:type="dxa"/>
+            </w:tcMar>
+            <w:vAlign w:val="center"/>
+          </w:tcPr>
+          <w:p>
+            <w:pPr>
+              <w:spacing w:before="0" w:after="40" w:line="276" w:lineRule="auto"/>
+            </w:pPr>
+            <w:r>
+              <w:rPr>
+                <w:rFonts w:ascii="Calibri" w:hAnsi="Calibri" w:eastAsia="Microsoft YaHei"/>
+                <w:b/>
+                <w:color w:val="1A1A1A"/>
+                <w:sz w:val="18"/>
+              </w:rPr>
               <w:t>role_id</w:t>
             </w:r>
           </w:p>
@@ -1965,6 +2033,45 @@
           <w:color w:val="1A1A1A"/>
         </w:rPr>
         <w:t>客户代运营账号：每个客户必须独立角色，不能共享文章和反馈。</w:t>
+      </w:r>
+    </w:p>
+    <w:p>
+      <w:pPr>
+        <w:pStyle w:val="Heading2"/>
+      </w:pPr>
+      <w:r>
+        <w:t>4.4 更新与克隆角色</w:t>
+      </w:r>
+    </w:p>
+    <w:p>
+      <w:r>
+        <w:rPr>
+          <w:rFonts w:ascii="Calibri" w:hAnsi="Calibri" w:eastAsia="Microsoft YaHei"/>
+          <w:color w:val="1A1A1A"/>
+        </w:rPr>
+        <w:t>使用 PATCH /roles/{role_id} 修改身份规则或角色默认生成参数。需要同一作者管理另一个平台时，使用 POST /roles/{role_id}/clone；它复制 identity_rules 和默认参数，但不复制历史文章、画像、反馈或生成记录。</w:t>
+      </w:r>
+    </w:p>
+    <w:p>
+      <w:pPr>
+        <w:spacing w:before="120" w:after="160" w:line="288" w:lineRule="auto"/>
+        <w:ind w:left="202" w:right="202"/>
+        <w:shd w:fill="F4F6F9"/>
+      </w:pPr>
+      <w:r>
+        <w:rPr>
+          <w:rFonts w:ascii="Calibri" w:hAnsi="Calibri" w:eastAsia="Microsoft YaHei"/>
+          <w:b/>
+          <w:color w:val="1F4D78"/>
+        </w:rPr>
+        <w:t xml:space="preserve">参数优先级  </w:t>
+      </w:r>
+      <w:r>
+        <w:rPr>
+          <w:rFonts w:ascii="Calibri" w:hAnsi="Calibri" w:eastAsia="Microsoft YaHei"/>
+          <w:color w:val="1A1A1A"/>
+        </w:rPr>
+        <w:t>生成时按“系统默认值 → 角色默认值 → 本次请求显式值”合并。本次请求优先，响应中的 effective_request 是最终实际使用的完整参数。</w:t>
       </w:r>
     </w:p>
     <w:p>
@@ -3345,7 +3452,7 @@
           <w:rFonts w:ascii="Calibri" w:hAnsi="Calibri" w:eastAsia="Microsoft YaHei"/>
           <w:color w:val="1A1A1A"/>
         </w:rPr>
-        <w:t>使用 POST /posts/upload，可上传 PDF、TXT 或 Markdown，单文件最大 10 MB。上传时填写的 platform、language、content_type、topic、tone 和 authenticity 会应用到本次拆出的所有文章。</w:t>
+        <w:t>推荐使用 POST /posts/bulk-upload，一次选择最多 30 个 PDF、TXT 或 Markdown 文件；单文件最大 10 MB、整批最大 50 MB。只需填写一次 role_id 和真实性，其余元数据可以留空。POST /posts/upload 与它共用同一套自动标注和去重逻辑。</w:t>
       </w:r>
     </w:p>
     <w:p>
@@ -3400,7 +3507,7 @@
           <w:rFonts w:ascii="Calibri" w:hAnsi="Calibri" w:eastAsia="Microsoft YaHei"/>
           <w:color w:val="1A1A1A"/>
         </w:rPr>
-        <w:t>如果文章平台、语言或类型不同，分成多个文件上传，例如 linkedin-zh-education.md、linkedin-en-education.md、wechat-product.md。不要给完全不同的文章统一贴同一组标签。</w:t>
+        <w:t>系统会根据文件名和正文推断标题、平台、语言、内容类型、主题、语气与发布日期，并用规范化正文指纹跳过重复文章。批量数据库写入在一个事务中完成，写入异常时整批回滚。</w:t>
       </w:r>
     </w:p>
     <w:p>
@@ -3408,7 +3515,48 @@
         <w:pStyle w:val="Heading2"/>
       </w:pPr>
       <w:r>
-        <w:t>5.5 语料质量检查</w:t>
+        <w:t>5.5 导入后纠错</w:t>
+      </w:r>
+    </w:p>
+    <w:p>
+      <w:r>
+        <w:rPr>
+          <w:rFonts w:ascii="Calibri" w:hAnsi="Calibri" w:eastAsia="Microsoft YaHei"/>
+          <w:color w:val="1A1A1A"/>
+        </w:rPr>
+        <w:t>自动标注不确定时，使用 PATCH /posts/{post_id} 修正单篇；同一批文章标错时，使用 PATCH /posts/bulk 提交 role_id、post_ids 和 changes。批量修正会先验证全部文章属于该角色，任意一条不符合时整批不修改。</w:t>
+      </w:r>
+    </w:p>
+    <w:p>
+      <w:pPr>
+        <w:keepLines/>
+        <w:spacing w:before="80" w:after="160" w:line="252" w:lineRule="auto"/>
+        <w:ind w:left="259" w:right="259"/>
+        <w:shd w:fill="F2F4F7"/>
+      </w:pPr>
+      <w:r>
+        <w:rPr>
+          <w:rFonts w:ascii="Consolas" w:hAnsi="Consolas" w:eastAsia="Microsoft YaHei"/>
+          <w:color w:val="28323C"/>
+          <w:sz w:val="17"/>
+        </w:rPr>
+        <w:t>{</w:t>
+        <w:br/>
+        <w:t xml:space="preserve">  "role_id": 3,</w:t>
+        <w:br/>
+        <w:t xml:space="preserve">  "post_ids": [12, 13, 14],</w:t>
+        <w:br/>
+        <w:t xml:space="preserve">  "changes": {"platform": "小红书", "content_type": "项目复盘", "authenticity": 5}</w:t>
+        <w:br/>
+        <w:t>}</w:t>
+      </w:r>
+    </w:p>
+    <w:p>
+      <w:pPr>
+        <w:pStyle w:val="Heading2"/>
+      </w:pPr>
+      <w:r>
+        <w:t>5.6 语料质量检查</w:t>
       </w:r>
     </w:p>
     <w:p>
@@ -3526,7 +3674,7 @@
           <w:rFonts w:ascii="Calibri" w:hAnsi="Calibri" w:eastAsia="Microsoft YaHei"/>
           <w:color w:val="1A1A1A"/>
         </w:rPr>
-        <w:t>导入高真实性文章后，调用 POST /profile/rebuild?role_id=3。系统只选择 authenticity 为 4–5 的文章，最多使用 30 篇，并生成中英文画像。</w:t>
+        <w:t>导入高真实性文章后，调用 POST /profile/rebuild?role_id=3。系统只选择 retrieval_status=ACTIVE 且 authenticity 为 4–5 的文章，最多使用 30 篇，并生成中英文画像。</w:t>
       </w:r>
     </w:p>
     <w:p>
@@ -4531,6 +4679,32 @@
     </w:p>
     <w:p>
       <w:pPr>
+        <w:pStyle w:val="Heading2"/>
+      </w:pPr>
+      <w:r>
+        <w:t>7.3 检索纠错与文章停用</w:t>
+      </w:r>
+    </w:p>
+    <w:p>
+      <w:r>
+        <w:rPr>
+          <w:rFonts w:ascii="Calibri" w:hAnsi="Calibri" w:eastAsia="Microsoft YaHei"/>
+          <w:color w:val="1A1A1A"/>
+        </w:rPr>
+        <w:t>某篇命中文章只是不适合本次任务时，向 POST /generations/{run_id}/retrieval-feedback 提交 NOT_RELEVANT。当前该动作返回 effect=RECORDED_ONLY，只留下任务级审计，不会暗中修改排序或真实性。</w:t>
+      </w:r>
+    </w:p>
+    <w:p>
+      <w:r>
+        <w:rPr>
+          <w:rFonts w:ascii="Calibri" w:hAnsi="Calibri" w:eastAsia="Microsoft YaHei"/>
+          <w:color w:val="1A1A1A"/>
+        </w:rPr>
+        <w:t>文章已经过时或不再代表本人时，向 POST /posts/{post_id}/retrieval-status 提交 RETIRE；人工确认恢复时提交 RESTORE。只有 ACTIVE 文章能进入后续 RAG 和画像重建，所有停用与恢复动作可通过 /posts/{post_id}/retrieval-actions 查询。</w:t>
+      </w:r>
+    </w:p>
+    <w:p>
+      <w:pPr>
         <w:pStyle w:val="Heading1"/>
       </w:pPr>
       <w:r>
@@ -4543,7 +4717,7 @@
           <w:rFonts w:ascii="Calibri" w:hAnsi="Calibri" w:eastAsia="Microsoft YaHei"/>
           <w:color w:val="1A1A1A"/>
         </w:rPr>
-        <w:t>调用 POST /generate。建议第一次让系统生成 3 个候选版本，比较结构和语气后再人工选择。</w:t>
+        <w:t>调用 POST /generate。角色已配置 default_generate_params 时，通常只需要提交 role_id、topic 和 proof_points；需要变化的字段在本次请求中覆盖。建议第一次生成 3 个候选版本。</w:t>
       </w:r>
     </w:p>
     <w:p>
@@ -5332,6 +5506,28 @@
     </w:p>
     <w:p>
       <w:pPr>
+        <w:spacing w:before="120" w:after="160" w:line="288" w:lineRule="auto"/>
+        <w:ind w:left="202" w:right="202"/>
+        <w:shd w:fill="F4F6F9"/>
+      </w:pPr>
+      <w:r>
+        <w:rPr>
+          <w:rFonts w:ascii="Calibri" w:hAnsi="Calibri" w:eastAsia="Microsoft YaHei"/>
+          <w:b/>
+          <w:color w:val="1F4D78"/>
+        </w:rPr>
+        <w:t xml:space="preserve">核对实际参数  </w:t>
+      </w:r>
+      <w:r>
+        <w:rPr>
+          <w:rFonts w:ascii="Calibri" w:hAnsi="Calibri" w:eastAsia="Microsoft YaHei"/>
+          <w:color w:val="1A1A1A"/>
+        </w:rPr>
+        <w:t>查看响应中的 effective_request。它展示系统默认值、角色默认值和本次显式参数合并后的最终结果；HTTP、CLI 和代码直接调用现在使用同一套解析逻辑。</w:t>
+      </w:r>
+    </w:p>
+    <w:p>
+      <w:pPr>
         <w:pStyle w:val="Heading2"/>
       </w:pPr>
       <w:r>
@@ -5980,7 +6176,33 @@
           <w:rFonts w:ascii="Calibri" w:hAnsi="Calibri" w:eastAsia="Microsoft YaHei"/>
           <w:color w:val="1A1A1A"/>
         </w:rPr>
-        <w:t>每次生成会返回 run_id、初稿、终稿、状态、评审记录和检索文章。使用 GET /generations/{run_id} 可以回看完整运行资料。</w:t>
+        <w:t>每次生成会返回 run_id、初稿、终稿、状态、评审记录、检索文章、effective_request 和按顺序保存的运行 steps。使用 GET /generations/{run_id} 可以回看完整运行资料。</w:t>
+      </w:r>
+    </w:p>
+    <w:p>
+      <w:pPr>
+        <w:pStyle w:val="Heading2"/>
+      </w:pPr>
+      <w:r>
+        <w:t>9.1 人工审批闭环</w:t>
+      </w:r>
+    </w:p>
+    <w:p>
+      <w:r>
+        <w:rPr>
+          <w:rFonts w:ascii="Calibri" w:hAnsi="Calibri" w:eastAsia="Microsoft YaHei"/>
+          <w:color w:val="1A1A1A"/>
+        </w:rPr>
+        <w:t>成功生成后不会自动发布，而是进入 PENDING_REVIEW。使用 GET /review-inbox?role_id=3&amp;status=PENDING_REVIEW&amp;limit=100&amp;offset=0 分页查看；列表中的 review_summary 直接说明审核次数、改写轮数、累计问题和阻塞原因。</w:t>
+      </w:r>
+    </w:p>
+    <w:p>
+      <w:r>
+        <w:rPr>
+          <w:rFonts w:ascii="Calibri" w:hAnsi="Calibri" w:eastAsia="Microsoft YaHei"/>
+          <w:color w:val="1A1A1A"/>
+        </w:rPr>
+        <w:t>向 POST /generations/{run_id}/review-actions 提交 EDIT、APPROVE 或 REJECT。EDIT 保存人工终稿并继续等待批准；APPROVE 确认发布前版本；REJECT 必须填写原因。每个动作都保留前后文本和 diff，编辑已批准内容会重新进入待审。</w:t>
       </w:r>
     </w:p>
     <w:p>
@@ -6124,7 +6346,50 @@
           <w:rFonts w:ascii="Calibri" w:hAnsi="Calibri" w:eastAsia="Microsoft YaHei"/>
           <w:color w:val="1A1A1A"/>
         </w:rPr>
-        <w:t>后续任务只会检索最相关的少量反馈案例，不会把全部历史修改都塞进模型上下文。</w:t>
+        <w:t>新反馈先进入 CANDIDATE，不会立即影响生成。人工确认它代表稳定偏好后，向 POST /feedback/{feedback_id}/admission 提交 ADMIT；一次性活动要求或错误修改提交 REJECT。只有 ADMITTED 反馈会进入后续检索。</w:t>
+      </w:r>
+    </w:p>
+    <w:p>
+      <w:pPr>
+        <w:pStyle w:val="Heading2"/>
+      </w:pPr>
+      <w:r>
+        <w:t>10.2 批量准入反馈</w:t>
+      </w:r>
+    </w:p>
+    <w:p>
+      <w:r>
+        <w:rPr>
+          <w:rFonts w:ascii="Calibri" w:hAnsi="Calibri" w:eastAsia="Microsoft YaHei"/>
+          <w:color w:val="1A1A1A"/>
+        </w:rPr>
+        <w:t>候选反馈较多时，使用 POST /feedback/admission/bulk，一次最多处理 100 条。所有 ID 必须属于指定角色且仍为 CANDIDATE，任一条不符合时整批回滚。</w:t>
+      </w:r>
+    </w:p>
+    <w:p>
+      <w:pPr>
+        <w:keepLines/>
+        <w:spacing w:before="80" w:after="160" w:line="252" w:lineRule="auto"/>
+        <w:ind w:left="259" w:right="259"/>
+        <w:shd w:fill="F2F4F7"/>
+      </w:pPr>
+      <w:r>
+        <w:rPr>
+          <w:rFonts w:ascii="Consolas" w:hAnsi="Consolas" w:eastAsia="Microsoft YaHei"/>
+          <w:color w:val="28323C"/>
+          <w:sz w:val="17"/>
+        </w:rPr>
+        <w:t>{</w:t>
+        <w:br/>
+        <w:t xml:space="preserve">  "role_id": 3,</w:t>
+        <w:br/>
+        <w:t xml:space="preserve">  "feedback_ids": [21, 22, 23],</w:t>
+        <w:br/>
+        <w:t xml:space="preserve">  "action": "ADMIT",</w:t>
+        <w:br/>
+        <w:t xml:space="preserve">  "reason": "均代表稳定的写作偏好"</w:t>
+        <w:br/>
+        <w:t>}</w:t>
       </w:r>
     </w:p>
     <w:p>
@@ -6332,7 +6597,7 @@
                 <w:color w:val="1A1A1A"/>
                 <w:sz w:val="18"/>
               </w:rPr>
-              <w:t>导入过去关于 GEO、品牌风险、AI Visibility 的真实文章，代表性文章设为 4–5。</w:t>
+              <w:t>用 /posts/bulk-upload 导入真实文章，检查自动标签，代表性文章设为 4–5。</w:t>
             </w:r>
           </w:p>
         </w:tc>
@@ -6576,7 +6841,7 @@
                 <w:color w:val="1A1A1A"/>
                 <w:sz w:val="18"/>
               </w:rPr>
-              <w:t>人工选择</w:t>
+              <w:t>人工审批</w:t>
             </w:r>
           </w:p>
         </w:tc>
@@ -6602,7 +6867,7 @@
                 <w:color w:val="1A1A1A"/>
                 <w:sz w:val="18"/>
               </w:rPr>
-              <w:t>选出最接近本人的版本，删除仍显营销或不准确的句子。</w:t>
+              <w:t>在 review-inbox 中编辑候选，确认事实后 APPROVE 或说明原因 REJECT。</w:t>
             </w:r>
           </w:p>
         </w:tc>
@@ -6656,7 +6921,7 @@
                 <w:color w:val="1A1A1A"/>
                 <w:sz w:val="18"/>
               </w:rPr>
-              <w:t>POST /feedback，写明删改原因。</w:t>
+              <w:t>POST /feedback 写明删改原因，再决定 ADMIT 或 REJECT。</w:t>
             </w:r>
           </w:p>
         </w:tc>
@@ -6836,7 +7101,7 @@
           <w:rFonts w:ascii="Calibri" w:hAnsi="Calibri" w:eastAsia="Microsoft YaHei"/>
           <w:color w:val="1A1A1A"/>
         </w:rPr>
-        <w:t>保存有代表性的修改反馈。</w:t>
+        <w:t>保存有代表性的修改反馈，并只准入稳定偏好。</w:t>
       </w:r>
     </w:p>
     <w:p>
@@ -6860,7 +7125,7 @@
           <w:rFonts w:ascii="Calibri" w:hAnsi="Calibri" w:eastAsia="Microsoft YaHei"/>
           <w:color w:val="1A1A1A"/>
         </w:rPr>
-        <w:t>哪些主题经常检索到错误文章？</w:t>
+        <w:t>哪些主题经常出现 NOT_RELEVANT 记录？</w:t>
       </w:r>
     </w:p>
     <w:p>
@@ -6924,7 +7189,7 @@
           <w:rFonts w:ascii="Calibri" w:hAnsi="Calibri" w:eastAsia="Microsoft YaHei"/>
           <w:color w:val="1A1A1A"/>
         </w:rPr>
-        <w:t>是否存在已过期事实或不应公开的语料？</w:t>
+        <w:t>是否存在应 RETIRE 的过期文章或不应公开语料？</w:t>
       </w:r>
     </w:p>
     <w:p>
@@ -6986,7 +7251,7 @@
           <w:rFonts w:ascii="Calibri" w:hAnsi="Calibri" w:eastAsia="Microsoft YaHei"/>
           <w:color w:val="1A1A1A"/>
         </w:rPr>
-        <w:t>测试覆盖字符 n-gram、相关性排序、角色数据隔离、文章拆分、数字门禁、画像、生成—评审闭环和运行记录。mock 模式不会把文章发给外部模型。</w:t>
+        <w:t>当前完整测试共 57 项，覆盖字符 n-gram、混合排序、角色隔离、批量导入与事务回滚、默认参数、反馈准入、人工审批、文章停用恢复、数字门禁、评测和完整运行轨迹。mock 模式不会把文章发给外部模型。</w:t>
       </w:r>
     </w:p>
     <w:p>
@@ -7902,6 +8167,86 @@
                 <w:color w:val="1A1A1A"/>
                 <w:sz w:val="18"/>
               </w:rPr>
+              <w:t>POST/PATCH</w:t>
+            </w:r>
+          </w:p>
+        </w:tc>
+        <w:tc>
+          <w:tcPr>
+            <w:tcW w:type="dxa" w:w="3400"/>
+            <w:tcMar>
+              <w:top w:w="80" w:type="dxa"/>
+              <w:start w:w="120" w:type="dxa"/>
+              <w:bottom w:w="80" w:type="dxa"/>
+              <w:end w:w="120" w:type="dxa"/>
+            </w:tcMar>
+            <w:vAlign w:val="center"/>
+          </w:tcPr>
+          <w:p>
+            <w:pPr>
+              <w:spacing w:before="0" w:after="40" w:line="276" w:lineRule="auto"/>
+            </w:pPr>
+            <w:r>
+              <w:rPr>
+                <w:rFonts w:ascii="Calibri" w:hAnsi="Calibri" w:eastAsia="Microsoft YaHei"/>
+                <w:b w:val="0"/>
+                <w:color w:val="1A1A1A"/>
+                <w:sz w:val="18"/>
+              </w:rPr>
+              <w:t>/roles · /roles/{id}</w:t>
+            </w:r>
+          </w:p>
+        </w:tc>
+        <w:tc>
+          <w:tcPr>
+            <w:tcW w:type="dxa" w:w="4860"/>
+            <w:tcMar>
+              <w:top w:w="80" w:type="dxa"/>
+              <w:start w:w="120" w:type="dxa"/>
+              <w:bottom w:w="80" w:type="dxa"/>
+              <w:end w:w="120" w:type="dxa"/>
+            </w:tcMar>
+            <w:vAlign w:val="center"/>
+          </w:tcPr>
+          <w:p>
+            <w:pPr>
+              <w:spacing w:before="0" w:after="40" w:line="276" w:lineRule="auto"/>
+            </w:pPr>
+            <w:r>
+              <w:rPr>
+                <w:rFonts w:ascii="Calibri" w:hAnsi="Calibri" w:eastAsia="Microsoft YaHei"/>
+                <w:b w:val="0"/>
+                <w:color w:val="1A1A1A"/>
+                <w:sz w:val="18"/>
+              </w:rPr>
+              <w:t>创建或更新角色与默认任务参数</w:t>
+            </w:r>
+          </w:p>
+        </w:tc>
+      </w:tr>
+      <w:tr>
+        <w:tc>
+          <w:tcPr>
+            <w:tcW w:type="dxa" w:w="1100"/>
+            <w:tcMar>
+              <w:top w:w="80" w:type="dxa"/>
+              <w:start w:w="120" w:type="dxa"/>
+              <w:bottom w:w="80" w:type="dxa"/>
+              <w:end w:w="120" w:type="dxa"/>
+            </w:tcMar>
+            <w:vAlign w:val="center"/>
+          </w:tcPr>
+          <w:p>
+            <w:pPr>
+              <w:spacing w:before="0" w:after="40" w:line="276" w:lineRule="auto"/>
+            </w:pPr>
+            <w:r>
+              <w:rPr>
+                <w:rFonts w:ascii="Calibri" w:hAnsi="Calibri" w:eastAsia="Microsoft YaHei"/>
+                <w:b w:val="0"/>
+                <w:color w:val="1A1A1A"/>
+                <w:sz w:val="18"/>
+              </w:rPr>
               <w:t>POST</w:t>
             </w:r>
           </w:p>
@@ -7928,7 +8273,7 @@
                 <w:color w:val="1A1A1A"/>
                 <w:sz w:val="18"/>
               </w:rPr>
-              <w:t>/roles</w:t>
+              <w:t>/roles/{id}/clone</w:t>
             </w:r>
           </w:p>
         </w:tc>
@@ -7954,7 +8299,7 @@
                 <w:color w:val="1A1A1A"/>
                 <w:sz w:val="18"/>
               </w:rPr>
-              <w:t>创建角色</w:t>
+              <w:t>复制角色规则和默认参数，不复制记忆</w:t>
             </w:r>
           </w:p>
         </w:tc>
@@ -8168,7 +8513,7 @@
                 <w:color w:val="1A1A1A"/>
                 <w:sz w:val="18"/>
               </w:rPr>
-              <w:t>/posts/upload</w:t>
+              <w:t>/posts/bulk-upload</w:t>
             </w:r>
           </w:p>
         </w:tc>
@@ -8194,7 +8539,167 @@
                 <w:color w:val="1A1A1A"/>
                 <w:sz w:val="18"/>
               </w:rPr>
-              <w:t>上传并拆分 PDF/TXT/Markdown</w:t>
+              <w:t>批量上传、自动标注、去重并事务写入</w:t>
+            </w:r>
+          </w:p>
+        </w:tc>
+      </w:tr>
+      <w:tr>
+        <w:tc>
+          <w:tcPr>
+            <w:tcW w:type="dxa" w:w="1100"/>
+            <w:tcMar>
+              <w:top w:w="80" w:type="dxa"/>
+              <w:start w:w="120" w:type="dxa"/>
+              <w:bottom w:w="80" w:type="dxa"/>
+              <w:end w:w="120" w:type="dxa"/>
+            </w:tcMar>
+            <w:vAlign w:val="center"/>
+          </w:tcPr>
+          <w:p>
+            <w:pPr>
+              <w:spacing w:before="0" w:after="40" w:line="276" w:lineRule="auto"/>
+            </w:pPr>
+            <w:r>
+              <w:rPr>
+                <w:rFonts w:ascii="Calibri" w:hAnsi="Calibri" w:eastAsia="Microsoft YaHei"/>
+                <w:b w:val="0"/>
+                <w:color w:val="1A1A1A"/>
+                <w:sz w:val="18"/>
+              </w:rPr>
+              <w:t>PATCH</w:t>
+            </w:r>
+          </w:p>
+        </w:tc>
+        <w:tc>
+          <w:tcPr>
+            <w:tcW w:type="dxa" w:w="3400"/>
+            <w:tcMar>
+              <w:top w:w="80" w:type="dxa"/>
+              <w:start w:w="120" w:type="dxa"/>
+              <w:bottom w:w="80" w:type="dxa"/>
+              <w:end w:w="120" w:type="dxa"/>
+            </w:tcMar>
+            <w:vAlign w:val="center"/>
+          </w:tcPr>
+          <w:p>
+            <w:pPr>
+              <w:spacing w:before="0" w:after="40" w:line="276" w:lineRule="auto"/>
+            </w:pPr>
+            <w:r>
+              <w:rPr>
+                <w:rFonts w:ascii="Calibri" w:hAnsi="Calibri" w:eastAsia="Microsoft YaHei"/>
+                <w:b w:val="0"/>
+                <w:color w:val="1A1A1A"/>
+                <w:sz w:val="18"/>
+              </w:rPr>
+              <w:t>/posts/bulk</w:t>
+            </w:r>
+          </w:p>
+        </w:tc>
+        <w:tc>
+          <w:tcPr>
+            <w:tcW w:type="dxa" w:w="4860"/>
+            <w:tcMar>
+              <w:top w:w="80" w:type="dxa"/>
+              <w:start w:w="120" w:type="dxa"/>
+              <w:bottom w:w="80" w:type="dxa"/>
+              <w:end w:w="120" w:type="dxa"/>
+            </w:tcMar>
+            <w:vAlign w:val="center"/>
+          </w:tcPr>
+          <w:p>
+            <w:pPr>
+              <w:spacing w:before="0" w:after="40" w:line="276" w:lineRule="auto"/>
+            </w:pPr>
+            <w:r>
+              <w:rPr>
+                <w:rFonts w:ascii="Calibri" w:hAnsi="Calibri" w:eastAsia="Microsoft YaHei"/>
+                <w:b w:val="0"/>
+                <w:color w:val="1A1A1A"/>
+                <w:sz w:val="18"/>
+              </w:rPr>
+              <w:t>批量纠正文章元数据</w:t>
+            </w:r>
+          </w:p>
+        </w:tc>
+      </w:tr>
+      <w:tr>
+        <w:tc>
+          <w:tcPr>
+            <w:tcW w:type="dxa" w:w="1100"/>
+            <w:tcMar>
+              <w:top w:w="80" w:type="dxa"/>
+              <w:start w:w="120" w:type="dxa"/>
+              <w:bottom w:w="80" w:type="dxa"/>
+              <w:end w:w="120" w:type="dxa"/>
+            </w:tcMar>
+            <w:vAlign w:val="center"/>
+          </w:tcPr>
+          <w:p>
+            <w:pPr>
+              <w:spacing w:before="0" w:after="40" w:line="276" w:lineRule="auto"/>
+            </w:pPr>
+            <w:r>
+              <w:rPr>
+                <w:rFonts w:ascii="Calibri" w:hAnsi="Calibri" w:eastAsia="Microsoft YaHei"/>
+                <w:b w:val="0"/>
+                <w:color w:val="1A1A1A"/>
+                <w:sz w:val="18"/>
+              </w:rPr>
+              <w:t>POST</w:t>
+            </w:r>
+          </w:p>
+        </w:tc>
+        <w:tc>
+          <w:tcPr>
+            <w:tcW w:type="dxa" w:w="3400"/>
+            <w:tcMar>
+              <w:top w:w="80" w:type="dxa"/>
+              <w:start w:w="120" w:type="dxa"/>
+              <w:bottom w:w="80" w:type="dxa"/>
+              <w:end w:w="120" w:type="dxa"/>
+            </w:tcMar>
+            <w:vAlign w:val="center"/>
+          </w:tcPr>
+          <w:p>
+            <w:pPr>
+              <w:spacing w:before="0" w:after="40" w:line="276" w:lineRule="auto"/>
+            </w:pPr>
+            <w:r>
+              <w:rPr>
+                <w:rFonts w:ascii="Calibri" w:hAnsi="Calibri" w:eastAsia="Microsoft YaHei"/>
+                <w:b w:val="0"/>
+                <w:color w:val="1A1A1A"/>
+                <w:sz w:val="18"/>
+              </w:rPr>
+              <w:t>/posts/{id}/retrieval-status</w:t>
+            </w:r>
+          </w:p>
+        </w:tc>
+        <w:tc>
+          <w:tcPr>
+            <w:tcW w:type="dxa" w:w="4860"/>
+            <w:tcMar>
+              <w:top w:w="80" w:type="dxa"/>
+              <w:start w:w="120" w:type="dxa"/>
+              <w:bottom w:w="80" w:type="dxa"/>
+              <w:end w:w="120" w:type="dxa"/>
+            </w:tcMar>
+            <w:vAlign w:val="center"/>
+          </w:tcPr>
+          <w:p>
+            <w:pPr>
+              <w:spacing w:before="0" w:after="40" w:line="276" w:lineRule="auto"/>
+            </w:pPr>
+            <w:r>
+              <w:rPr>
+                <w:rFonts w:ascii="Calibri" w:hAnsi="Calibri" w:eastAsia="Microsoft YaHei"/>
+                <w:b w:val="0"/>
+                <w:color w:val="1A1A1A"/>
+                <w:sz w:val="18"/>
+              </w:rPr>
+              <w:t>停用或恢复文章的检索资格</w:t>
             </w:r>
           </w:p>
         </w:tc>
@@ -8542,7 +9047,7 @@
                 <w:color w:val="1A1A1A"/>
                 <w:sz w:val="18"/>
               </w:rPr>
-              <w:t>POST</w:t>
+              <w:t>GET/POST</w:t>
             </w:r>
           </w:p>
         </w:tc>
@@ -8594,7 +9099,247 @@
                 <w:color w:val="1A1A1A"/>
                 <w:sz w:val="18"/>
               </w:rPr>
-              <w:t>保存本人终稿和修改原因</w:t>
+              <w:t>查询反馈或创建候选反馈</w:t>
+            </w:r>
+          </w:p>
+        </w:tc>
+      </w:tr>
+      <w:tr>
+        <w:tc>
+          <w:tcPr>
+            <w:tcW w:type="dxa" w:w="1100"/>
+            <w:tcMar>
+              <w:top w:w="80" w:type="dxa"/>
+              <w:start w:w="120" w:type="dxa"/>
+              <w:bottom w:w="80" w:type="dxa"/>
+              <w:end w:w="120" w:type="dxa"/>
+            </w:tcMar>
+            <w:vAlign w:val="center"/>
+          </w:tcPr>
+          <w:p>
+            <w:pPr>
+              <w:spacing w:before="0" w:after="40" w:line="276" w:lineRule="auto"/>
+            </w:pPr>
+            <w:r>
+              <w:rPr>
+                <w:rFonts w:ascii="Calibri" w:hAnsi="Calibri" w:eastAsia="Microsoft YaHei"/>
+                <w:b w:val="0"/>
+                <w:color w:val="1A1A1A"/>
+                <w:sz w:val="18"/>
+              </w:rPr>
+              <w:t>POST</w:t>
+            </w:r>
+          </w:p>
+        </w:tc>
+        <w:tc>
+          <w:tcPr>
+            <w:tcW w:type="dxa" w:w="3400"/>
+            <w:tcMar>
+              <w:top w:w="80" w:type="dxa"/>
+              <w:start w:w="120" w:type="dxa"/>
+              <w:bottom w:w="80" w:type="dxa"/>
+              <w:end w:w="120" w:type="dxa"/>
+            </w:tcMar>
+            <w:vAlign w:val="center"/>
+          </w:tcPr>
+          <w:p>
+            <w:pPr>
+              <w:spacing w:before="0" w:after="40" w:line="276" w:lineRule="auto"/>
+            </w:pPr>
+            <w:r>
+              <w:rPr>
+                <w:rFonts w:ascii="Calibri" w:hAnsi="Calibri" w:eastAsia="Microsoft YaHei"/>
+                <w:b w:val="0"/>
+                <w:color w:val="1A1A1A"/>
+                <w:sz w:val="18"/>
+              </w:rPr>
+              <w:t>/feedback/admission/bulk</w:t>
+            </w:r>
+          </w:p>
+        </w:tc>
+        <w:tc>
+          <w:tcPr>
+            <w:tcW w:type="dxa" w:w="4860"/>
+            <w:tcMar>
+              <w:top w:w="80" w:type="dxa"/>
+              <w:start w:w="120" w:type="dxa"/>
+              <w:bottom w:w="80" w:type="dxa"/>
+              <w:end w:w="120" w:type="dxa"/>
+            </w:tcMar>
+            <w:vAlign w:val="center"/>
+          </w:tcPr>
+          <w:p>
+            <w:pPr>
+              <w:spacing w:before="0" w:after="40" w:line="276" w:lineRule="auto"/>
+            </w:pPr>
+            <w:r>
+              <w:rPr>
+                <w:rFonts w:ascii="Calibri" w:hAnsi="Calibri" w:eastAsia="Microsoft YaHei"/>
+                <w:b w:val="0"/>
+                <w:color w:val="1A1A1A"/>
+                <w:sz w:val="18"/>
+              </w:rPr>
+              <w:t>批量准入或拒绝候选反馈</w:t>
+            </w:r>
+          </w:p>
+        </w:tc>
+      </w:tr>
+      <w:tr>
+        <w:tc>
+          <w:tcPr>
+            <w:tcW w:type="dxa" w:w="1100"/>
+            <w:tcMar>
+              <w:top w:w="80" w:type="dxa"/>
+              <w:start w:w="120" w:type="dxa"/>
+              <w:bottom w:w="80" w:type="dxa"/>
+              <w:end w:w="120" w:type="dxa"/>
+            </w:tcMar>
+            <w:vAlign w:val="center"/>
+          </w:tcPr>
+          <w:p>
+            <w:pPr>
+              <w:spacing w:before="0" w:after="40" w:line="276" w:lineRule="auto"/>
+            </w:pPr>
+            <w:r>
+              <w:rPr>
+                <w:rFonts w:ascii="Calibri" w:hAnsi="Calibri" w:eastAsia="Microsoft YaHei"/>
+                <w:b w:val="0"/>
+                <w:color w:val="1A1A1A"/>
+                <w:sz w:val="18"/>
+              </w:rPr>
+              <w:t>GET</w:t>
+            </w:r>
+          </w:p>
+        </w:tc>
+        <w:tc>
+          <w:tcPr>
+            <w:tcW w:type="dxa" w:w="3400"/>
+            <w:tcMar>
+              <w:top w:w="80" w:type="dxa"/>
+              <w:start w:w="120" w:type="dxa"/>
+              <w:bottom w:w="80" w:type="dxa"/>
+              <w:end w:w="120" w:type="dxa"/>
+            </w:tcMar>
+            <w:vAlign w:val="center"/>
+          </w:tcPr>
+          <w:p>
+            <w:pPr>
+              <w:spacing w:before="0" w:after="40" w:line="276" w:lineRule="auto"/>
+            </w:pPr>
+            <w:r>
+              <w:rPr>
+                <w:rFonts w:ascii="Calibri" w:hAnsi="Calibri" w:eastAsia="Microsoft YaHei"/>
+                <w:b w:val="0"/>
+                <w:color w:val="1A1A1A"/>
+                <w:sz w:val="18"/>
+              </w:rPr>
+              <w:t>/review-inbox</w:t>
+            </w:r>
+          </w:p>
+        </w:tc>
+        <w:tc>
+          <w:tcPr>
+            <w:tcW w:type="dxa" w:w="4860"/>
+            <w:tcMar>
+              <w:top w:w="80" w:type="dxa"/>
+              <w:start w:w="120" w:type="dxa"/>
+              <w:bottom w:w="80" w:type="dxa"/>
+              <w:end w:w="120" w:type="dxa"/>
+            </w:tcMar>
+            <w:vAlign w:val="center"/>
+          </w:tcPr>
+          <w:p>
+            <w:pPr>
+              <w:spacing w:before="0" w:after="40" w:line="276" w:lineRule="auto"/>
+            </w:pPr>
+            <w:r>
+              <w:rPr>
+                <w:rFonts w:ascii="Calibri" w:hAnsi="Calibri" w:eastAsia="Microsoft YaHei"/>
+                <w:b w:val="0"/>
+                <w:color w:val="1A1A1A"/>
+                <w:sz w:val="18"/>
+              </w:rPr>
+              <w:t>分页查看待人工审核内容与摘要</w:t>
+            </w:r>
+          </w:p>
+        </w:tc>
+      </w:tr>
+      <w:tr>
+        <w:tc>
+          <w:tcPr>
+            <w:tcW w:type="dxa" w:w="1100"/>
+            <w:tcMar>
+              <w:top w:w="80" w:type="dxa"/>
+              <w:start w:w="120" w:type="dxa"/>
+              <w:bottom w:w="80" w:type="dxa"/>
+              <w:end w:w="120" w:type="dxa"/>
+            </w:tcMar>
+            <w:vAlign w:val="center"/>
+          </w:tcPr>
+          <w:p>
+            <w:pPr>
+              <w:spacing w:before="0" w:after="40" w:line="276" w:lineRule="auto"/>
+            </w:pPr>
+            <w:r>
+              <w:rPr>
+                <w:rFonts w:ascii="Calibri" w:hAnsi="Calibri" w:eastAsia="Microsoft YaHei"/>
+                <w:b w:val="0"/>
+                <w:color w:val="1A1A1A"/>
+                <w:sz w:val="18"/>
+              </w:rPr>
+              <w:t>POST</w:t>
+            </w:r>
+          </w:p>
+        </w:tc>
+        <w:tc>
+          <w:tcPr>
+            <w:tcW w:type="dxa" w:w="3400"/>
+            <w:tcMar>
+              <w:top w:w="80" w:type="dxa"/>
+              <w:start w:w="120" w:type="dxa"/>
+              <w:bottom w:w="80" w:type="dxa"/>
+              <w:end w:w="120" w:type="dxa"/>
+            </w:tcMar>
+            <w:vAlign w:val="center"/>
+          </w:tcPr>
+          <w:p>
+            <w:pPr>
+              <w:spacing w:before="0" w:after="40" w:line="276" w:lineRule="auto"/>
+            </w:pPr>
+            <w:r>
+              <w:rPr>
+                <w:rFonts w:ascii="Calibri" w:hAnsi="Calibri" w:eastAsia="Microsoft YaHei"/>
+                <w:b w:val="0"/>
+                <w:color w:val="1A1A1A"/>
+                <w:sz w:val="18"/>
+              </w:rPr>
+              <w:t>/generations/{id}/review-actions</w:t>
+            </w:r>
+          </w:p>
+        </w:tc>
+        <w:tc>
+          <w:tcPr>
+            <w:tcW w:type="dxa" w:w="4860"/>
+            <w:tcMar>
+              <w:top w:w="80" w:type="dxa"/>
+              <w:start w:w="120" w:type="dxa"/>
+              <w:bottom w:w="80" w:type="dxa"/>
+              <w:end w:w="120" w:type="dxa"/>
+            </w:tcMar>
+            <w:vAlign w:val="center"/>
+          </w:tcPr>
+          <w:p>
+            <w:pPr>
+              <w:spacing w:before="0" w:after="40" w:line="276" w:lineRule="auto"/>
+            </w:pPr>
+            <w:r>
+              <w:rPr>
+                <w:rFonts w:ascii="Calibri" w:hAnsi="Calibri" w:eastAsia="Microsoft YaHei"/>
+                <w:b w:val="0"/>
+                <w:color w:val="1A1A1A"/>
+                <w:sz w:val="18"/>
+              </w:rPr>
+              <w:t>编辑、批准或拒绝内容</w:t>
             </w:r>
           </w:p>
         </w:tc>
@@ -8675,6 +9420,86 @@
                 <w:sz w:val="18"/>
               </w:rPr>
               <w:t>回看一次生成运行</w:t>
+            </w:r>
+          </w:p>
+        </w:tc>
+      </w:tr>
+      <w:tr>
+        <w:tc>
+          <w:tcPr>
+            <w:tcW w:type="dxa" w:w="1100"/>
+            <w:tcMar>
+              <w:top w:w="80" w:type="dxa"/>
+              <w:start w:w="120" w:type="dxa"/>
+              <w:bottom w:w="80" w:type="dxa"/>
+              <w:end w:w="120" w:type="dxa"/>
+            </w:tcMar>
+            <w:vAlign w:val="center"/>
+          </w:tcPr>
+          <w:p>
+            <w:pPr>
+              <w:spacing w:before="0" w:after="40" w:line="276" w:lineRule="auto"/>
+            </w:pPr>
+            <w:r>
+              <w:rPr>
+                <w:rFonts w:ascii="Calibri" w:hAnsi="Calibri" w:eastAsia="Microsoft YaHei"/>
+                <w:b w:val="0"/>
+                <w:color w:val="1A1A1A"/>
+                <w:sz w:val="18"/>
+              </w:rPr>
+              <w:t>POST</w:t>
+            </w:r>
+          </w:p>
+        </w:tc>
+        <w:tc>
+          <w:tcPr>
+            <w:tcW w:type="dxa" w:w="3400"/>
+            <w:tcMar>
+              <w:top w:w="80" w:type="dxa"/>
+              <w:start w:w="120" w:type="dxa"/>
+              <w:bottom w:w="80" w:type="dxa"/>
+              <w:end w:w="120" w:type="dxa"/>
+            </w:tcMar>
+            <w:vAlign w:val="center"/>
+          </w:tcPr>
+          <w:p>
+            <w:pPr>
+              <w:spacing w:before="0" w:after="40" w:line="276" w:lineRule="auto"/>
+            </w:pPr>
+            <w:r>
+              <w:rPr>
+                <w:rFonts w:ascii="Calibri" w:hAnsi="Calibri" w:eastAsia="Microsoft YaHei"/>
+                <w:b w:val="0"/>
+                <w:color w:val="1A1A1A"/>
+                <w:sz w:val="18"/>
+              </w:rPr>
+              <w:t>/eval-runs</w:t>
+            </w:r>
+          </w:p>
+        </w:tc>
+        <w:tc>
+          <w:tcPr>
+            <w:tcW w:type="dxa" w:w="4860"/>
+            <w:tcMar>
+              <w:top w:w="80" w:type="dxa"/>
+              <w:start w:w="120" w:type="dxa"/>
+              <w:bottom w:w="80" w:type="dxa"/>
+              <w:end w:w="120" w:type="dxa"/>
+            </w:tcMar>
+            <w:vAlign w:val="center"/>
+          </w:tcPr>
+          <w:p>
+            <w:pPr>
+              <w:spacing w:before="0" w:after="40" w:line="276" w:lineRule="auto"/>
+            </w:pPr>
+            <w:r>
+              <w:rPr>
+                <w:rFonts w:ascii="Calibri" w:hAnsi="Calibri" w:eastAsia="Microsoft YaHei"/>
+                <w:b w:val="0"/>
+                <w:color w:val="1A1A1A"/>
+                <w:sz w:val="18"/>
+              </w:rPr>
+              <w:t>对已有生成运行执行确定性评测</w:t>
             </w:r>
           </w:p>
         </w:tc>
@@ -8950,6 +9775,60 @@
                 <w:color w:val="1A1A1A"/>
                 <w:sz w:val="18"/>
               </w:rPr>
+              <w:t>app/ingestion.py</w:t>
+            </w:r>
+          </w:p>
+        </w:tc>
+        <w:tc>
+          <w:tcPr>
+            <w:tcW w:type="dxa" w:w="6360"/>
+            <w:tcMar>
+              <w:top w:w="80" w:type="dxa"/>
+              <w:start w:w="120" w:type="dxa"/>
+              <w:bottom w:w="80" w:type="dxa"/>
+              <w:end w:w="120" w:type="dxa"/>
+            </w:tcMar>
+            <w:vAlign w:val="center"/>
+          </w:tcPr>
+          <w:p>
+            <w:pPr>
+              <w:spacing w:before="0" w:after="40" w:line="276" w:lineRule="auto"/>
+            </w:pPr>
+            <w:r>
+              <w:rPr>
+                <w:rFonts w:ascii="Calibri" w:hAnsi="Calibri" w:eastAsia="Microsoft YaHei"/>
+                <w:b w:val="0"/>
+                <w:color w:val="1A1A1A"/>
+                <w:sz w:val="18"/>
+              </w:rPr>
+              <w:t>自动元数据、正文指纹、统一上传流程</w:t>
+            </w:r>
+          </w:p>
+        </w:tc>
+      </w:tr>
+      <w:tr>
+        <w:tc>
+          <w:tcPr>
+            <w:tcW w:type="dxa" w:w="3000"/>
+            <w:tcMar>
+              <w:top w:w="80" w:type="dxa"/>
+              <w:start w:w="120" w:type="dxa"/>
+              <w:bottom w:w="80" w:type="dxa"/>
+              <w:end w:w="120" w:type="dxa"/>
+            </w:tcMar>
+            <w:vAlign w:val="center"/>
+          </w:tcPr>
+          <w:p>
+            <w:pPr>
+              <w:spacing w:before="0" w:after="40" w:line="276" w:lineRule="auto"/>
+            </w:pPr>
+            <w:r>
+              <w:rPr>
+                <w:rFonts w:ascii="Calibri" w:hAnsi="Calibri" w:eastAsia="Microsoft YaHei"/>
+                <w:b/>
+                <w:color w:val="1A1A1A"/>
+                <w:sz w:val="18"/>
+              </w:rPr>
               <w:t>app/retrieval.py</w:t>
             </w:r>
           </w:p>
@@ -9139,6 +10018,60 @@
                 <w:sz w:val="18"/>
               </w:rPr>
               <w:t>接口字段与校验</w:t>
+            </w:r>
+          </w:p>
+        </w:tc>
+      </w:tr>
+      <w:tr>
+        <w:tc>
+          <w:tcPr>
+            <w:tcW w:type="dxa" w:w="3000"/>
+            <w:tcMar>
+              <w:top w:w="80" w:type="dxa"/>
+              <w:start w:w="120" w:type="dxa"/>
+              <w:bottom w:w="80" w:type="dxa"/>
+              <w:end w:w="120" w:type="dxa"/>
+            </w:tcMar>
+            <w:vAlign w:val="center"/>
+          </w:tcPr>
+          <w:p>
+            <w:pPr>
+              <w:spacing w:before="0" w:after="40" w:line="276" w:lineRule="auto"/>
+            </w:pPr>
+            <w:r>
+              <w:rPr>
+                <w:rFonts w:ascii="Calibri" w:hAnsi="Calibri" w:eastAsia="Microsoft YaHei"/>
+                <w:b/>
+                <w:color w:val="1A1A1A"/>
+                <w:sz w:val="18"/>
+              </w:rPr>
+              <w:t>app/evals/</w:t>
+            </w:r>
+          </w:p>
+        </w:tc>
+        <w:tc>
+          <w:tcPr>
+            <w:tcW w:type="dxa" w:w="6360"/>
+            <w:tcMar>
+              <w:top w:w="80" w:type="dxa"/>
+              <w:start w:w="120" w:type="dxa"/>
+              <w:bottom w:w="80" w:type="dxa"/>
+              <w:end w:w="120" w:type="dxa"/>
+            </w:tcMar>
+            <w:vAlign w:val="center"/>
+          </w:tcPr>
+          <w:p>
+            <w:pPr>
+              <w:spacing w:before="0" w:after="40" w:line="276" w:lineRule="auto"/>
+            </w:pPr>
+            <w:r>
+              <w:rPr>
+                <w:rFonts w:ascii="Calibri" w:hAnsi="Calibri" w:eastAsia="Microsoft YaHei"/>
+                <w:b w:val="0"/>
+                <w:color w:val="1A1A1A"/>
+                <w:sz w:val="18"/>
+              </w:rPr>
+              <w:t>确定性评测、运行比较和结果报告</w:t>
             </w:r>
           </w:p>
         </w:tc>

</xml_diff>